<commit_message>
Improve backup handling and streamline the user interface
</commit_message>
<xml_diff>
--- a/docs/IED Backup Manager.docx
+++ b/docs/IED Backup Manager.docx
@@ -15,12 +15,12 @@
         <w:pStyle w:val="Subtitle"/>
       </w:pPr>
       <w:r>
-        <w:t>Manual de uso e diagnóstico  |  Versão 1.17.2</w:t>
+        <w:t>Manual de uso e diagnóstico  |  Versão 1.18.0</w:t>
       </w:r>
     </w:p>
     <w:p>
       <w:r>
-        <w:t>Este manual apresenta o fluxo operacional atual do aplicativo, incluindo os temas claro e escuro, regras de backup, integridade, limpeza de HIS e diagnóstico de encerramentos inesperados.</w:t>
+        <w:t>Este manual apresenta o fluxo operacional atual do aplicativo, incluindo temas, identidade por família de software, decisões entre backups da mesma SE, integridade, limpeza de HIS e diagnóstico de encerramentos inesperados.</w:t>
       </w:r>
     </w:p>
     <w:p>
@@ -1002,6 +1002,101 @@
     </w:p>
     <w:p>
       <w:pPr>
+        <w:pStyle w:val="Heading2"/>
+      </w:pPr>
+      <w:r>
+        <w:t>Backup atual e famílias de software</w:t>
+      </w:r>
+    </w:p>
+    <w:p>
+      <w:r>
+        <w:t>Uma alteração somente na versão do mesmo software atualiza o backup da mesma família em ATU. O arquivo anterior é movido para HIS, e as versões completas continuam registradas nos nomes e no histórico.</w:t>
+      </w:r>
+    </w:p>
+    <w:p>
+      <w:r>
+        <w:t>Quando a mesma SE já possui um backup individual de outra família, a prévia mostra Decisão necessária. Ao gerar, o aplicativo explica três opções:</w:t>
+      </w:r>
+    </w:p>
+    <w:p>
+      <w:pPr>
+        <w:pStyle w:val="ListBullet"/>
+      </w:pPr>
+      <w:r>
+        <w:t>Manter os dois: considera partes complementares; ambos permanecem em ATU.</w:t>
+      </w:r>
+    </w:p>
+    <w:p>
+      <w:pPr>
+        <w:pStyle w:val="ListBullet"/>
+      </w:pPr>
+      <w:r>
+        <w:t>Substituir existente: considera um novo desenvolvimento; move o anterior para HIS depois de uma segunda confirmação.</w:t>
+      </w:r>
+    </w:p>
+    <w:p>
+      <w:pPr>
+        <w:pStyle w:val="ListBullet"/>
+      </w:pPr>
+      <w:r>
+        <w:t>Cancelar: não cria, move ou modifica arquivos.</w:t>
+      </w:r>
+    </w:p>
+    <w:p>
+      <w:r>
+        <w:t>Um IED-PACK substitui automaticamente somente os backups individuais das famílias incluídas no pacote. Se já existir um IED-PACK, gere novamente o pacote agrupado em vez de substituí-lo por um backup individual.</w:t>
+      </w:r>
+    </w:p>
+    <w:p>
+      <w:pPr>
+        <w:jc w:val="center"/>
+      </w:pPr>
+      <w:r/>
+      <w:r>
+        <w:drawing>
+          <wp:inline xmlns:a="http://schemas.openxmlformats.org/drawingml/2006/main" xmlns:pic="http://schemas.openxmlformats.org/drawingml/2006/picture">
+            <wp:extent cx="5303520" cy="2768437"/>
+            <wp:docPr id="6" name="Picture 6"/>
+            <wp:cNvGraphicFramePr>
+              <a:graphicFrameLocks noChangeAspect="1"/>
+            </wp:cNvGraphicFramePr>
+            <a:graphic>
+              <a:graphicData uri="http://schemas.openxmlformats.org/drawingml/2006/picture">
+                <pic:pic>
+                  <pic:nvPicPr>
+                    <pic:cNvPr id="0" name="pt-software-choice.png"/>
+                    <pic:cNvPicPr/>
+                  </pic:nvPicPr>
+                  <pic:blipFill>
+                    <a:blip r:embed="rId15"/>
+                    <a:stretch>
+                      <a:fillRect/>
+                    </a:stretch>
+                  </pic:blipFill>
+                  <pic:spPr>
+                    <a:xfrm>
+                      <a:off x="0" y="0"/>
+                      <a:ext cx="5303520" cy="2768437"/>
+                    </a:xfrm>
+                    <a:prstGeom prst="rect"/>
+                  </pic:spPr>
+                </pic:pic>
+              </a:graphicData>
+            </a:graphic>
+          </wp:inline>
+        </w:drawing>
+      </w:r>
+    </w:p>
+    <w:p>
+      <w:pPr>
+        <w:jc w:val="center"/>
+      </w:pPr>
+      <w:r>
+        <w:t>Exemplo da decisão entre softwares</w:t>
+      </w:r>
+    </w:p>
+    <w:p>
+      <w:pPr>
         <w:pStyle w:val="Heading1"/>
       </w:pPr>
       <w:r>
@@ -1513,6 +1608,7 @@
     </w:p>
     <w:sectPr>
       <w:footerReference w:type="default" r:id="rId9"/>
+      <w:headerReference w:type="default" r:id="rId16"/>
       <w:pgSz w:w="12240" w:h="15840"/>
       <w:pgMar w:top="1037" w:right="1181" w:bottom="1037" w:left="1181" w:header="720" w:footer="720" w:gutter="0"/>
       <w:cols w:space="720"/>
@@ -1530,15 +1626,20 @@
       <w:jc w:val="center"/>
     </w:pPr>
     <w:r>
-      <w:rPr>
-        <w:rFonts w:ascii="Aptos" w:hAnsi="Aptos"/>
-        <w:color w:val="606973"/>
-        <w:sz w:val="16"/>
-      </w:rPr>
-      <w:t>IED Backup Manager v1.17.2  |  Manual de uso</w:t>
+      <w:t>IED Backup Manager v1.18.0 | Manual de uso</w:t>
     </w:r>
   </w:p>
 </w:ftr>
+</file>
+
+<file path=word/header1.xml><?xml version="1.0" encoding="utf-8"?>
+<w:hdr xmlns:m="http://schemas.openxmlformats.org/officeDocument/2006/math" xmlns:mc="http://schemas.openxmlformats.org/markup-compatibility/2006" xmlns:mo="http://schemas.microsoft.com/office/mac/office/2008/main" xmlns:mv="urn:schemas-microsoft-com:mac:vml" xmlns:o="urn:schemas-microsoft-com:office:office" xmlns:r="http://schemas.openxmlformats.org/officeDocument/2006/relationships" xmlns:v="urn:schemas-microsoft-com:vml" xmlns:w10="urn:schemas-microsoft-com:office:word" xmlns:w14="http://schemas.microsoft.com/office/word/2010/wordml" xmlns:w="http://schemas.openxmlformats.org/wordprocessingml/2006/main" xmlns:wne="http://schemas.microsoft.com/office/word/2006/wordml" xmlns:wp14="http://schemas.microsoft.com/office/word/2010/wordprocessingDrawing" xmlns:wp="http://schemas.openxmlformats.org/drawingml/2006/wordprocessingDrawing" xmlns:wpc="http://schemas.microsoft.com/office/word/2010/wordprocessingCanvas" xmlns:wpg="http://schemas.microsoft.com/office/word/2010/wordprocessingGroup" xmlns:wpi="http://schemas.microsoft.com/office/word/2010/wordprocessingInk" xmlns:wps="http://schemas.microsoft.com/office/word/2010/wordprocessingShape" mc:Ignorable="w14 wp14">
+  <w:p>
+    <w:pPr>
+      <w:pStyle w:val="Header"/>
+    </w:pPr>
+  </w:p>
+</w:hdr>
 </file>
 
 <file path=word/numbering.xml><?xml version="1.0" encoding="utf-8"?>

</xml_diff>